<commit_message>
removed clutter and added SDE resume
</commit_message>
<xml_diff>
--- a/Bharat_Resume.docx
+++ b/Bharat_Resume.docx
@@ -267,7 +267,21 @@
         <w:rPr>
           <w:b/>
         </w:rPr>
-        <w:t>Grade XII, Vidyatree Modern World School</w:t>
+        <w:t xml:space="preserve">Grade XII, </w:t>
+      </w:r>
+      <w:proofErr w:type="spellStart"/>
+      <w:r>
+        <w:rPr>
+          <w:b/>
+        </w:rPr>
+        <w:t>Vidyatree</w:t>
+      </w:r>
+      <w:proofErr w:type="spellEnd"/>
+      <w:r>
+        <w:rPr>
+          <w:b/>
+        </w:rPr>
+        <w:t xml:space="preserve"> Modern World School</w:t>
       </w:r>
       <w:r>
         <w:rPr>
@@ -359,7 +373,21 @@
         <w:rPr>
           <w:bCs/>
         </w:rPr>
-        <w:t>TensorFlow, Scikit-learn, FastAPI, Pandas, NumPy, OpenAI Gym</w:t>
+        <w:t xml:space="preserve">TensorFlow, Scikit-learn, </w:t>
+      </w:r>
+      <w:proofErr w:type="spellStart"/>
+      <w:r>
+        <w:rPr>
+          <w:bCs/>
+        </w:rPr>
+        <w:t>FastAPI</w:t>
+      </w:r>
+      <w:proofErr w:type="spellEnd"/>
+      <w:r>
+        <w:rPr>
+          <w:bCs/>
+        </w:rPr>
+        <w:t>, Pandas, NumPy, OpenAI Gym</w:t>
       </w:r>
     </w:p>
     <w:p>
@@ -434,6 +462,7 @@
         </w:rPr>
       </w:pPr>
       <w:hyperlink r:id="rId9" w:history="1">
+        <w:proofErr w:type="spellStart"/>
         <w:r>
           <w:rPr>
             <w:rStyle w:val="Hyperlink"/>
@@ -442,7 +471,18 @@
             <w:szCs w:val="28"/>
             <w:u w:val="none"/>
           </w:rPr>
-          <w:t>DepoIndex: AI-Powered Legal Document Indexing</w:t>
+          <w:t>DepoIndex</w:t>
+        </w:r>
+        <w:proofErr w:type="spellEnd"/>
+        <w:r>
+          <w:rPr>
+            <w:rStyle w:val="Hyperlink"/>
+            <w:bCs/>
+            <w:sz w:val="24"/>
+            <w:szCs w:val="28"/>
+            <w:u w:val="none"/>
+          </w:rPr>
+          <w:t>: AI-Powered Legal Document Indexing</w:t>
         </w:r>
       </w:hyperlink>
       <w:r>
@@ -558,153 +598,6 @@
         </w:rPr>
       </w:pPr>
       <w:hyperlink r:id="rId10" w:history="1">
-        <w:r>
-          <w:rPr>
-            <w:rStyle w:val="Hyperlink"/>
-            <w:sz w:val="24"/>
-            <w:szCs w:val="32"/>
-            <w:u w:val="none"/>
-          </w:rPr>
-          <w:t>Attentia.ai- Adaptive Attentio</w:t>
-        </w:r>
-        <w:r>
-          <w:rPr>
-            <w:rStyle w:val="Hyperlink"/>
-            <w:sz w:val="24"/>
-            <w:szCs w:val="32"/>
-            <w:u w:val="none"/>
-          </w:rPr>
-          <w:t>n</w:t>
-        </w:r>
-        <w:r>
-          <w:rPr>
-            <w:rStyle w:val="Hyperlink"/>
-            <w:sz w:val="24"/>
-            <w:szCs w:val="32"/>
-            <w:u w:val="none"/>
-          </w:rPr>
-          <w:t xml:space="preserve"> Aware learning system</w:t>
-        </w:r>
-      </w:hyperlink>
-      <w:r>
-        <w:rPr>
-          <w:sz w:val="24"/>
-          <w:szCs w:val="32"/>
-        </w:rPr>
-        <w:t xml:space="preserve"> | </w:t>
-      </w:r>
-      <w:r>
-        <w:rPr>
-          <w:sz w:val="22"/>
-          <w:szCs w:val="28"/>
-        </w:rPr>
-        <w:t>Python, FastAPI, OpenCV, MediaPipe, Reinforcement Learning</w:t>
-      </w:r>
-    </w:p>
-    <w:p>
-      <w:pPr>
-        <w:pStyle w:val="ListParagraph"/>
-        <w:numPr>
-          <w:ilvl w:val="0"/>
-          <w:numId w:val="16"/>
-        </w:numPr>
-        <w:jc w:val="both"/>
-      </w:pPr>
-      <w:r>
-        <w:t>Designed a stochastic user-behavior simulation and decision system using tabular Q-learning to adapt intervention strategies based on attention and emotional state.</w:t>
-      </w:r>
-    </w:p>
-    <w:p>
-      <w:pPr>
-        <w:pStyle w:val="ListParagraph"/>
-        <w:numPr>
-          <w:ilvl w:val="0"/>
-          <w:numId w:val="16"/>
-        </w:numPr>
-        <w:jc w:val="both"/>
-      </w:pPr>
-      <w:r>
-        <w:t>Implemented multi-modal attention detection using OpenCV and MediaPipe, combining facial landmarks, head pose, and audio signals.</w:t>
-      </w:r>
-    </w:p>
-    <w:p>
-      <w:pPr>
-        <w:pStyle w:val="ListParagraph"/>
-        <w:numPr>
-          <w:ilvl w:val="0"/>
-          <w:numId w:val="16"/>
-        </w:numPr>
-        <w:jc w:val="both"/>
-      </w:pPr>
-      <w:r>
-        <w:t>Engineered a personalized baseline calibration mechanism to detect relative deviations in user engagement during live sessions.</w:t>
-      </w:r>
-    </w:p>
-    <w:p>
-      <w:pPr>
-        <w:pStyle w:val="ListParagraph"/>
-        <w:numPr>
-          <w:ilvl w:val="0"/>
-          <w:numId w:val="16"/>
-        </w:numPr>
-        <w:jc w:val="both"/>
-      </w:pPr>
-      <w:r>
-        <w:t>Defined backend data flow and API interaction patterns to support low-latency processing of real-time attention signals.</w:t>
-      </w:r>
-    </w:p>
-    <w:p>
-      <w:pPr>
-        <w:pStyle w:val="ListParagraph"/>
-        <w:numPr>
-          <w:ilvl w:val="0"/>
-          <w:numId w:val="16"/>
-        </w:numPr>
-        <w:jc w:val="both"/>
-      </w:pPr>
-      <w:r>
-        <w:t>Built FastAPI endpoints to integrate real-time inputs with the decision engine and trigger adaptive interventions.</w:t>
-      </w:r>
-    </w:p>
-    <w:p>
-      <w:pPr>
-        <w:numPr>
-          <w:ilvl w:val="0"/>
-          <w:numId w:val="16"/>
-        </w:numPr>
-        <w:spacing w:before="100" w:beforeAutospacing="1" w:line="240" w:lineRule="auto"/>
-        <w:jc w:val="both"/>
-        <w:rPr>
-          <w:color w:val="auto"/>
-          <w:kern w:val="0"/>
-          <w:sz w:val="22"/>
-          <w:szCs w:val="22"/>
-          <w14:ligatures w14:val="none"/>
-        </w:rPr>
-      </w:pPr>
-      <w:r>
-        <w:rPr>
-          <w:color w:val="auto"/>
-          <w:kern w:val="0"/>
-          <w:sz w:val="22"/>
-          <w:szCs w:val="22"/>
-          <w14:ligatures w14:val="none"/>
-        </w:rPr>
-        <w:t xml:space="preserve">Collaborated on integrating continuous audio input streams via WebSocket-based communication for real-time noise analysis. </w:t>
-      </w:r>
-    </w:p>
-    <w:p>
-      <w:pPr>
-        <w:ind w:left="0" w:firstLine="0"/>
-        <w:jc w:val="both"/>
-        <w:rPr>
-          <w:b/>
-          <w:bCs/>
-          <w:sz w:val="24"/>
-          <w:szCs w:val="32"/>
-        </w:rPr>
-      </w:pPr>
-      <w:hyperlink r:id="rId11" w:history="1">
         <w:r>
           <w:rPr>
             <w:rStyle w:val="Hyperlink"/>
@@ -714,7 +607,7 @@
             <w:szCs w:val="32"/>
             <w:u w:val="none"/>
           </w:rPr>
-          <w:t>MovieMix: Latent Semantic Movie Search Engine (MovieLens 25M)</w:t>
+          <w:t>Attentia.ai- Adaptive Attention Aware learning system</w:t>
         </w:r>
       </w:hyperlink>
       <w:r>
@@ -729,7 +622,247 @@
           <w:sz w:val="22"/>
           <w:szCs w:val="28"/>
         </w:rPr>
-        <w:t>Python, FastAPI, Docker, NumPy, Embeddings, Recommendation Systems</w:t>
+        <w:t xml:space="preserve">Python, </w:t>
+      </w:r>
+      <w:proofErr w:type="spellStart"/>
+      <w:r>
+        <w:rPr>
+          <w:sz w:val="22"/>
+          <w:szCs w:val="28"/>
+        </w:rPr>
+        <w:t>FastAPI</w:t>
+      </w:r>
+      <w:proofErr w:type="spellEnd"/>
+      <w:r>
+        <w:rPr>
+          <w:sz w:val="22"/>
+          <w:szCs w:val="28"/>
+        </w:rPr>
+        <w:t xml:space="preserve">, OpenCV, </w:t>
+      </w:r>
+      <w:proofErr w:type="spellStart"/>
+      <w:r>
+        <w:rPr>
+          <w:sz w:val="22"/>
+          <w:szCs w:val="28"/>
+        </w:rPr>
+        <w:t>MediaPipe</w:t>
+      </w:r>
+      <w:proofErr w:type="spellEnd"/>
+      <w:r>
+        <w:rPr>
+          <w:sz w:val="22"/>
+          <w:szCs w:val="28"/>
+        </w:rPr>
+        <w:t>, Reinforcement Learning</w:t>
+      </w:r>
+    </w:p>
+    <w:p>
+      <w:pPr>
+        <w:pStyle w:val="ListParagraph"/>
+        <w:numPr>
+          <w:ilvl w:val="0"/>
+          <w:numId w:val="16"/>
+        </w:numPr>
+        <w:jc w:val="both"/>
+      </w:pPr>
+      <w:r>
+        <w:t>Designed a stochastic user-</w:t>
+      </w:r>
+      <w:proofErr w:type="spellStart"/>
+      <w:r>
+        <w:t>behavior</w:t>
+      </w:r>
+      <w:proofErr w:type="spellEnd"/>
+      <w:r>
+        <w:t xml:space="preserve"> simulation and decision system using tabular Q-learning to adapt intervention strategies based on attention and emotional state.</w:t>
+      </w:r>
+    </w:p>
+    <w:p>
+      <w:pPr>
+        <w:pStyle w:val="ListParagraph"/>
+        <w:numPr>
+          <w:ilvl w:val="0"/>
+          <w:numId w:val="16"/>
+        </w:numPr>
+        <w:jc w:val="both"/>
+      </w:pPr>
+      <w:r>
+        <w:t xml:space="preserve">Implemented multi-modal attention detection using OpenCV and </w:t>
+      </w:r>
+      <w:proofErr w:type="spellStart"/>
+      <w:r>
+        <w:t>MediaPipe</w:t>
+      </w:r>
+      <w:proofErr w:type="spellEnd"/>
+      <w:r>
+        <w:t>, combining facial landmarks, head pose, and audio signals.</w:t>
+      </w:r>
+    </w:p>
+    <w:p>
+      <w:pPr>
+        <w:pStyle w:val="ListParagraph"/>
+        <w:numPr>
+          <w:ilvl w:val="0"/>
+          <w:numId w:val="16"/>
+        </w:numPr>
+        <w:jc w:val="both"/>
+      </w:pPr>
+      <w:r>
+        <w:t>Engineered a personalized baseline calibration mechanism to detect relative deviations in user engagement during live sessions.</w:t>
+      </w:r>
+    </w:p>
+    <w:p>
+      <w:pPr>
+        <w:pStyle w:val="ListParagraph"/>
+        <w:numPr>
+          <w:ilvl w:val="0"/>
+          <w:numId w:val="16"/>
+        </w:numPr>
+        <w:jc w:val="both"/>
+      </w:pPr>
+      <w:r>
+        <w:t>Defined backend data flow and API interaction patterns to support low-latency processing of real-time attention signals.</w:t>
+      </w:r>
+    </w:p>
+    <w:p>
+      <w:pPr>
+        <w:pStyle w:val="ListParagraph"/>
+        <w:numPr>
+          <w:ilvl w:val="0"/>
+          <w:numId w:val="16"/>
+        </w:numPr>
+        <w:jc w:val="both"/>
+      </w:pPr>
+      <w:r>
+        <w:t xml:space="preserve">Built </w:t>
+      </w:r>
+      <w:proofErr w:type="spellStart"/>
+      <w:r>
+        <w:t>FastAPI</w:t>
+      </w:r>
+      <w:proofErr w:type="spellEnd"/>
+      <w:r>
+        <w:t xml:space="preserve"> endpoints to integrate real-time inputs with the decision engine and trigger adaptive interventions.</w:t>
+      </w:r>
+    </w:p>
+    <w:p>
+      <w:pPr>
+        <w:numPr>
+          <w:ilvl w:val="0"/>
+          <w:numId w:val="16"/>
+        </w:numPr>
+        <w:spacing w:before="100" w:beforeAutospacing="1" w:line="240" w:lineRule="auto"/>
+        <w:jc w:val="both"/>
+        <w:rPr>
+          <w:color w:val="auto"/>
+          <w:kern w:val="0"/>
+          <w:sz w:val="22"/>
+          <w:szCs w:val="22"/>
+          <w14:ligatures w14:val="none"/>
+        </w:rPr>
+      </w:pPr>
+      <w:r>
+        <w:rPr>
+          <w:color w:val="auto"/>
+          <w:kern w:val="0"/>
+          <w:sz w:val="22"/>
+          <w:szCs w:val="22"/>
+          <w14:ligatures w14:val="none"/>
+        </w:rPr>
+        <w:t xml:space="preserve">Collaborated on integrating continuous audio input streams via WebSocket-based communication for real-time noise analysis. </w:t>
+      </w:r>
+    </w:p>
+    <w:p>
+      <w:pPr>
+        <w:ind w:left="0" w:firstLine="0"/>
+        <w:jc w:val="both"/>
+        <w:rPr>
+          <w:b/>
+          <w:bCs/>
+          <w:sz w:val="24"/>
+          <w:szCs w:val="32"/>
+        </w:rPr>
+      </w:pPr>
+      <w:hyperlink r:id="rId11" w:history="1">
+        <w:proofErr w:type="spellStart"/>
+        <w:r>
+          <w:rPr>
+            <w:rStyle w:val="Hyperlink"/>
+            <w:b/>
+            <w:bCs/>
+            <w:sz w:val="24"/>
+            <w:szCs w:val="32"/>
+            <w:u w:val="none"/>
+          </w:rPr>
+          <w:t>MovieMix</w:t>
+        </w:r>
+        <w:proofErr w:type="spellEnd"/>
+        <w:r>
+          <w:rPr>
+            <w:rStyle w:val="Hyperlink"/>
+            <w:b/>
+            <w:bCs/>
+            <w:sz w:val="24"/>
+            <w:szCs w:val="32"/>
+            <w:u w:val="none"/>
+          </w:rPr>
+          <w:t>: Latent Semantic Movie Search Engine (</w:t>
+        </w:r>
+        <w:proofErr w:type="spellStart"/>
+        <w:r>
+          <w:rPr>
+            <w:rStyle w:val="Hyperlink"/>
+            <w:b/>
+            <w:bCs/>
+            <w:sz w:val="24"/>
+            <w:szCs w:val="32"/>
+            <w:u w:val="none"/>
+          </w:rPr>
+          <w:t>MovieLens</w:t>
+        </w:r>
+        <w:proofErr w:type="spellEnd"/>
+        <w:r>
+          <w:rPr>
+            <w:rStyle w:val="Hyperlink"/>
+            <w:b/>
+            <w:bCs/>
+            <w:sz w:val="24"/>
+            <w:szCs w:val="32"/>
+            <w:u w:val="none"/>
+          </w:rPr>
+          <w:t xml:space="preserve"> 25M)</w:t>
+        </w:r>
+      </w:hyperlink>
+      <w:r>
+        <w:rPr>
+          <w:sz w:val="24"/>
+          <w:szCs w:val="32"/>
+        </w:rPr>
+        <w:t xml:space="preserve"> | </w:t>
+      </w:r>
+      <w:r>
+        <w:rPr>
+          <w:sz w:val="22"/>
+          <w:szCs w:val="28"/>
+        </w:rPr>
+        <w:t xml:space="preserve">Python, </w:t>
+      </w:r>
+      <w:proofErr w:type="spellStart"/>
+      <w:r>
+        <w:rPr>
+          <w:sz w:val="22"/>
+          <w:szCs w:val="28"/>
+        </w:rPr>
+        <w:t>FastAPI</w:t>
+      </w:r>
+      <w:proofErr w:type="spellEnd"/>
+      <w:r>
+        <w:rPr>
+          <w:sz w:val="22"/>
+          <w:szCs w:val="28"/>
+        </w:rPr>
+        <w:t>, Docker, NumPy, Embeddings, Recommendation Systems</w:t>
       </w:r>
     </w:p>
     <w:p>
@@ -904,12 +1037,21 @@
       <w:r>
         <w:t xml:space="preserve"> using </w:t>
       </w:r>
+      <w:proofErr w:type="spellStart"/>
       <w:r>
         <w:rPr>
           <w:b/>
           <w:bCs/>
         </w:rPr>
-        <w:t>FastAPI + Docker</w:t>
+        <w:t>FastAPI</w:t>
+      </w:r>
+      <w:proofErr w:type="spellEnd"/>
+      <w:r>
+        <w:rPr>
+          <w:b/>
+          <w:bCs/>
+        </w:rPr>
+        <w:t xml:space="preserve"> + Docker</w:t>
       </w:r>
       <w:r>
         <w:t>, enabling production-grade semantic movie retrieval.</w:t>
@@ -1048,7 +1190,23 @@
           <w:b/>
           <w:bCs/>
         </w:rPr>
-        <w:t>Global Rank 8261, TCS CodeVita (2024):</w:t>
+        <w:t xml:space="preserve">Global Rank 8261, TCS </w:t>
+      </w:r>
+      <w:proofErr w:type="spellStart"/>
+      <w:r>
+        <w:rPr>
+          <w:b/>
+          <w:bCs/>
+        </w:rPr>
+        <w:t>CodeVita</w:t>
+      </w:r>
+      <w:proofErr w:type="spellEnd"/>
+      <w:r>
+        <w:rPr>
+          <w:b/>
+          <w:bCs/>
+        </w:rPr>
+        <w:t xml:space="preserve"> (2024):</w:t>
       </w:r>
       <w:r>
         <w:t xml:space="preserve"> Advanced to the penultimate round </w:t>
@@ -1172,6 +1330,7 @@
           <w:b/>
           <w:bCs/>
         </w:rPr>
+        <w:lastRenderedPageBreak/>
         <w:t xml:space="preserve">Volunteer, Pahal Foundation: </w:t>
       </w:r>
       <w:r>
@@ -4379,6 +4538,7 @@
   <w:style w:type="character" w:default="1" w:styleId="DefaultParagraphFont">
     <w:name w:val="Default Paragraph Font"/>
     <w:uiPriority w:val="1"/>
+    <w:semiHidden/>
     <w:unhideWhenUsed/>
   </w:style>
   <w:style w:type="table" w:default="1" w:styleId="TableNormal">

</xml_diff>